<commit_message>
S.2648: withdraw redline, lead with Study Commission sequencing
Pull redline amendments across testimony, policy brief, and website.
RIBPI's position is that Chapter 19-14.3 is structurally flawed and
S.2648 should be held pending the Blockchain Study Commission
(H.7956/S.2198). A redline would imply the framework is sound.
</commit_message>
<xml_diff>
--- a/docs/Bitcoin_Energy_Research_Brief.docx
+++ b/docs/Bitcoin_Energy_Research_Brief.docx
@@ -11,7 +11,7 @@
           <w:rFonts w:ascii="Calibri" w:cs="Calibri" w:eastAsia="Calibri" w:hAnsi="Calibri"/>
           <w:b/>
           <w:bCs/>
-          <w:color w:val="0F766E"/>
+          <w:color w:val="3A7CC2"/>
           <w:sz w:val="16"/>
           <w:szCs w:val="16"/>
         </w:rPr>
@@ -30,7 +30,7 @@
           <w:rFonts w:ascii="Georgia" w:cs="Georgia" w:eastAsia="Georgia" w:hAnsi="Georgia"/>
           <w:b/>
           <w:bCs/>
-          <w:color w:val="1E293B"/>
+          <w:color w:val="062F5C"/>
           <w:sz w:val="28"/>
           <w:szCs w:val="28"/>
         </w:rPr>
@@ -44,7 +44,7 @@
       <w:r>
         <w:rPr>
           <w:rFonts w:ascii="Calibri" w:cs="Calibri" w:eastAsia="Calibri" w:hAnsi="Calibri"/>
-          <w:color w:val="94A3B8"/>
+          <w:color w:val="A0A0A0"/>
           <w:sz w:val="16"/>
           <w:szCs w:val="16"/>
         </w:rPr>
@@ -53,7 +53,7 @@
       <w:r>
         <w:rPr>
           <w:rFonts w:ascii="Calibri" w:cs="Calibri" w:eastAsia="Calibri" w:hAnsi="Calibri"/>
-          <w:color w:val="94A3B8"/>
+          <w:color w:val="A0A0A0"/>
           <w:sz w:val="16"/>
           <w:szCs w:val="16"/>
         </w:rPr>
@@ -62,7 +62,7 @@
       <w:r>
         <w:rPr>
           <w:rFonts w:ascii="Calibri" w:cs="Calibri" w:eastAsia="Calibri" w:hAnsi="Calibri"/>
-          <w:color w:val="94A3B8"/>
+          <w:color w:val="A0A0A0"/>
           <w:sz w:val="16"/>
           <w:szCs w:val="16"/>
         </w:rPr>
@@ -146,7 +146,7 @@
             <w:r>
               <w:rPr>
                 <w:rFonts w:ascii="Calibri" w:cs="Calibri" w:eastAsia="Calibri" w:hAnsi="Calibri"/>
-                <w:color w:val="94A3B8"/>
+                <w:color w:val="A0A0A0"/>
                 <w:sz w:val="15"/>
                 <w:szCs w:val="15"/>
               </w:rPr>
@@ -181,7 +181,7 @@
                 <w:rFonts w:ascii="Georgia" w:cs="Georgia" w:eastAsia="Georgia" w:hAnsi="Georgia"/>
                 <w:b/>
                 <w:bCs/>
-                <w:color w:val="D97706"/>
+                <w:color w:val="E67A00"/>
                 <w:sz w:val="26"/>
                 <w:szCs w:val="26"/>
               </w:rPr>
@@ -196,7 +196,7 @@
             <w:r>
               <w:rPr>
                 <w:rFonts w:ascii="Calibri" w:cs="Calibri" w:eastAsia="Calibri" w:hAnsi="Calibri"/>
-                <w:color w:val="94A3B8"/>
+                <w:color w:val="A0A0A0"/>
                 <w:sz w:val="15"/>
                 <w:szCs w:val="15"/>
               </w:rPr>
@@ -246,7 +246,7 @@
             <w:r>
               <w:rPr>
                 <w:rFonts w:ascii="Calibri" w:cs="Calibri" w:eastAsia="Calibri" w:hAnsi="Calibri"/>
-                <w:color w:val="94A3B8"/>
+                <w:color w:val="A0A0A0"/>
                 <w:sz w:val="15"/>
                 <w:szCs w:val="15"/>
               </w:rPr>
@@ -268,7 +268,7 @@
           <w:rFonts w:ascii="Calibri" w:cs="Calibri" w:eastAsia="Calibri" w:hAnsi="Calibri"/>
           <w:b/>
           <w:bCs/>
-          <w:color w:val="0F766E"/>
+          <w:color w:val="3A7CC2"/>
           <w:sz w:val="22"/>
           <w:szCs w:val="22"/>
         </w:rPr>
@@ -385,7 +385,7 @@
           <w:rFonts w:ascii="Calibri" w:cs="Calibri" w:eastAsia="Calibri" w:hAnsi="Calibri"/>
           <w:b/>
           <w:bCs/>
-          <w:color w:val="0F766E"/>
+          <w:color w:val="3A7CC2"/>
           <w:sz w:val="22"/>
           <w:szCs w:val="22"/>
         </w:rPr>
@@ -426,7 +426,7 @@
           <w:rFonts w:ascii="Calibri" w:cs="Calibri" w:eastAsia="Calibri" w:hAnsi="Calibri"/>
           <w:b/>
           <w:bCs/>
-          <w:color w:val="1E293B"/>
+          <w:color w:val="062F5C"/>
           <w:sz w:val="20"/>
           <w:szCs w:val="20"/>
         </w:rPr>
@@ -625,7 +625,7 @@
           <w:rFonts w:ascii="Calibri" w:cs="Calibri" w:eastAsia="Calibri" w:hAnsi="Calibri"/>
           <w:b/>
           <w:bCs/>
-          <w:color w:val="1E293B"/>
+          <w:color w:val="062F5C"/>
           <w:sz w:val="20"/>
           <w:szCs w:val="20"/>
         </w:rPr>
@@ -751,7 +751,7 @@
           <w:rFonts w:ascii="Calibri" w:cs="Calibri" w:eastAsia="Calibri" w:hAnsi="Calibri"/>
           <w:b/>
           <w:bCs/>
-          <w:color w:val="1E293B"/>
+          <w:color w:val="062F5C"/>
           <w:sz w:val="20"/>
           <w:szCs w:val="20"/>
         </w:rPr>
@@ -970,7 +970,7 @@
           <w:rFonts w:ascii="Calibri" w:cs="Calibri" w:eastAsia="Calibri" w:hAnsi="Calibri"/>
           <w:b/>
           <w:bCs/>
-          <w:color w:val="0F766E"/>
+          <w:color w:val="3A7CC2"/>
           <w:sz w:val="22"/>
           <w:szCs w:val="22"/>
         </w:rPr>
@@ -1174,7 +1174,7 @@
           <w:rFonts w:ascii="Calibri" w:cs="Calibri" w:eastAsia="Calibri" w:hAnsi="Calibri"/>
           <w:b/>
           <w:bCs/>
-          <w:color w:val="0F766E"/>
+          <w:color w:val="3A7CC2"/>
           <w:sz w:val="22"/>
           <w:szCs w:val="22"/>
         </w:rPr>
@@ -1998,7 +1998,7 @@
           <w:rFonts w:ascii="Calibri" w:cs="Calibri" w:eastAsia="Calibri" w:hAnsi="Calibri"/>
           <w:b/>
           <w:bCs/>
-          <w:color w:val="0F766E"/>
+          <w:color w:val="3A7CC2"/>
           <w:sz w:val="22"/>
           <w:szCs w:val="22"/>
         </w:rPr>
@@ -2135,7 +2135,7 @@
           <w:rFonts w:ascii="Calibri" w:cs="Calibri" w:eastAsia="Calibri" w:hAnsi="Calibri"/>
           <w:b/>
           <w:bCs/>
-          <w:color w:val="0F766E"/>
+          <w:color w:val="3A7CC2"/>
           <w:sz w:val="22"/>
           <w:szCs w:val="22"/>
         </w:rPr>
@@ -2196,7 +2196,7 @@
           <w:rFonts w:ascii="Calibri" w:cs="Calibri" w:eastAsia="Calibri" w:hAnsi="Calibri"/>
           <w:b/>
           <w:bCs/>
-          <w:color w:val="1E293B"/>
+          <w:color w:val="062F5C"/>
           <w:sz w:val="18"/>
           <w:szCs w:val="18"/>
         </w:rPr>
@@ -2205,7 +2205,7 @@
       <w:r>
         <w:rPr>
           <w:rFonts w:ascii="Calibri" w:cs="Calibri" w:eastAsia="Calibri" w:hAnsi="Calibri"/>
-          <w:color w:val="94A3B8"/>
+          <w:color w:val="A0A0A0"/>
           <w:sz w:val="18"/>
           <w:szCs w:val="18"/>
         </w:rPr>

</xml_diff>